<commit_message>
Space the title and subtitle apart in both IEEE builds
Before: the subtitle sat directly under the last line of the title with a
single line break between them, so the two read as one block of text.

After: there is a clear gap between the title and the subtitle, and another
before the author block.

In the LaTeX build the subtitle also needed its own leading. Sitting inside
the title group it inherited the baseline spacing set for the 24pt title, so
once the gap above it was added its own two lines were pushed just as far
apart. It now sets in a parbox, which gives it the leading of its own size.
</commit_message>
<xml_diff>
--- a/dist/Huntington_somatic_expansion_model_IEEE.docx
+++ b/dist/Huntington_somatic_expansion_model_IEEE.docx
@@ -4,7 +4,7 @@
   <w:body>
     <w:p>
       <w:pPr>
-        <w:spacing w:after="40" w:before="0" w:line="240" w:lineRule="auto"/>
+        <w:spacing w:after="220" w:before="0" w:line="240" w:lineRule="auto"/>
         <w:ind w:firstLine="0"/>
         <w:jc w:val="center"/>
       </w:pPr>
@@ -21,7 +21,7 @@
     </w:p>
     <w:p>
       <w:pPr>
-        <w:spacing w:after="200" w:before="0" w:line="240" w:lineRule="auto"/>
+        <w:spacing w:after="280" w:before="0" w:line="240" w:lineRule="auto"/>
         <w:ind w:firstLine="0"/>
         <w:jc w:val="center"/>
       </w:pPr>

</xml_diff>